<commit_message>
Rediseñar UI con Mantine y agregar ABM de productos, clientes y usuarios
- Reemplaza la interfaz artesanal por componentes de Mantine (tablas,
  modales, notificaciones) en las cuatro pantallas del frontend.
- Crea tablas reales `productos` y `clientes` (antes el catálogo se
  derivaba del historial de consultas y cada consulta generaba un
  cliente nuevo aunque fuera el mismo de siempre).
- Agrega ABM completo (alta, baja, modificación) para Productos, Obras
  sociales, Clientes y Usuarios del personal, con guardas para no
  autodesactivarse ni dejar la farmacia sin usuarios activos.
- El registro de una consulta ahora elige un producto del catálogo y
  busca o crea el cliente automáticamente, en vez de tipear todo a mano.
- Actualiza los documentos del informe para reflejar el ABM y el nuevo
  catálogo de productos/clientes.

Co-Authored-By: Claude Sonnet 5 <noreply@anthropic.com>
</commit_message>
<xml_diff>
--- a/FarmaConsulta - Arquitectura y Resumen del Sistema.docx
+++ b/FarmaConsulta - Arquitectura y Resumen del Sistema.docx
@@ -141,7 +141,7 @@
         <w:spacing w:after="80"/>
       </w:pPr>
       <w:r>
-        <w:t>Personal de farmacia: además de la consulta de precio, accede (con sesión iniciada) a un panel de análisis exploratorio y a la carga de nuevas obras sociales y consultas.</w:t>
+        <w:t>Personal de farmacia: además de la consulta de precio, accede (con sesión iniciada) a un panel de análisis exploratorio y a un ABM completo de productos, obras sociales, clientes y usuarios del personal.</w:t>
       </w:r>
     </w:p>
     <w:p>
@@ -227,7 +227,7 @@
         <w:spacing w:after="160"/>
       </w:pPr>
       <w:r>
-        <w:t>Interfaz web con la que interactúan clientes y personal: consulta de precio, comparación de medios de pago, alertas de stock, panel de análisis y administración.</w:t>
+        <w:t>Interfaz web con la que interactúan clientes y personal: consulta de precio, comparación de medios de pago, alertas de stock, panel de análisis y administración. Construida con la librería Mantine, para una experiencia más prolija y accesible.</w:t>
       </w:r>
     </w:p>
     <w:p>
@@ -267,7 +267,7 @@
         <w:spacing w:after="160"/>
       </w:pPr>
       <w:r>
-        <w:t>Reemplaza los archivos CSV del MVP original. Guarda las consultas históricas, los planes de descuento por obra social y los usuarios del personal de farmacia.</w:t>
+        <w:t>Reemplaza los archivos CSV del MVP original. Guarda las consultas históricas, los planes de descuento por obra social, los usuarios del personal de farmacia, y el catálogo de productos y clientes registrados.</w:t>
       </w:r>
     </w:p>
     <w:p>
@@ -495,6 +495,50 @@
             </w:pPr>
             <w:r>
               <w:t>Personal de farmacia habilitado para iniciar sesión (contraseña hasheada).</w:t>
+            </w:r>
+          </w:p>
+        </w:tc>
+      </w:tr>
+      <w:tr>
+        <w:tc>
+          <w:tcPr>
+            <w:tcW w:type="dxa" w:w="4873"/>
+          </w:tcPr>
+          <w:p>
+            <w:r>
+              <w:t>productos</w:t>
+            </w:r>
+          </w:p>
+        </w:tc>
+        <w:tc>
+          <w:tcPr>
+            <w:tcW w:type="dxa" w:w="4873"/>
+          </w:tcPr>
+          <w:p>
+            <w:r>
+              <w:t>Catálogo vigente de productos: nombre, categoría, precio de lista, stock disponible.</w:t>
+            </w:r>
+          </w:p>
+        </w:tc>
+      </w:tr>
+      <w:tr>
+        <w:tc>
+          <w:tcPr>
+            <w:tcW w:type="dxa" w:w="4873"/>
+          </w:tcPr>
+          <w:p>
+            <w:r>
+              <w:t>clientes</w:t>
+            </w:r>
+          </w:p>
+        </w:tc>
+        <w:tc>
+          <w:tcPr>
+            <w:tcW w:type="dxa" w:w="4873"/>
+          </w:tcPr>
+          <w:p>
+            <w:r>
+              <w:t>Clientes registrados (nombre, teléfono), deduplicados y reutilizados automáticamente al cargar una consulta nueva.</w:t>
             </w:r>
           </w:p>
         </w:tc>

</xml_diff>